<commit_message>
remove some test files
</commit_message>
<xml_diff>
--- a/20260514_docx_to_markdown/final/fixtures/docx/sample.docx
+++ b/20260514_docx_to_markdown/final/fixtures/docx/sample.docx
@@ -21,12 +21,246 @@
         <w:t>変換のテスト用に作成されたサンプルです。表と画像を含みます。</w:t>
       </w:r>
     </w:p>
+    <w:p/>
+    <w:p>
+      <w:pPr>
+        <w:pStyle w:val="a4"/>
+        <w:numPr>
+          <w:ilvl w:val="0"/>
+          <w:numId w:val="2"/>
+        </w:numPr>
+      </w:pPr>
+      <w:r>
+        <w:rPr>
+          <w:rFonts w:hint="eastAsia"/>
+        </w:rPr>
+        <w:t>これは</w:t>
+      </w:r>
+    </w:p>
+    <w:p>
+      <w:pPr>
+        <w:pStyle w:val="a4"/>
+        <w:numPr>
+          <w:ilvl w:val="1"/>
+          <w:numId w:val="2"/>
+        </w:numPr>
+      </w:pPr>
+      <w:r>
+        <w:rPr>
+          <w:rFonts w:hint="eastAsia"/>
+        </w:rPr>
+        <w:t>とても</w:t>
+      </w:r>
+    </w:p>
+    <w:p>
+      <w:pPr>
+        <w:pStyle w:val="a4"/>
+        <w:numPr>
+          <w:ilvl w:val="2"/>
+          <w:numId w:val="2"/>
+        </w:numPr>
+      </w:pPr>
+      <w:r>
+        <w:rPr>
+          <w:rFonts w:hint="eastAsia"/>
+        </w:rPr>
+        <w:t>だいじ</w:t>
+      </w:r>
+    </w:p>
+    <w:p>
+      <w:pPr>
+        <w:pStyle w:val="a4"/>
+        <w:numPr>
+          <w:ilvl w:val="1"/>
+          <w:numId w:val="2"/>
+        </w:numPr>
+      </w:pPr>
+      <w:r>
+        <w:rPr>
+          <w:rFonts w:hint="eastAsia"/>
+        </w:rPr>
+        <w:t>かも</w:t>
+      </w:r>
+    </w:p>
+    <w:p>
+      <w:pPr>
+        <w:pStyle w:val="a4"/>
+        <w:numPr>
+          <w:ilvl w:val="0"/>
+          <w:numId w:val="2"/>
+        </w:numPr>
+      </w:pPr>
+      <w:r>
+        <w:rPr>
+          <w:rFonts w:hint="eastAsia"/>
+        </w:rPr>
+        <w:t>しれない</w:t>
+      </w:r>
+    </w:p>
+    <w:p>
+      <w:pPr>
+        <w:pStyle w:val="a4"/>
+        <w:numPr>
+          <w:ilvl w:val="1"/>
+          <w:numId w:val="2"/>
+        </w:numPr>
+      </w:pPr>
+      <w:r>
+        <w:rPr>
+          <w:rFonts w:hint="eastAsia"/>
+        </w:rPr>
+        <w:t>ね</w:t>
+      </w:r>
+    </w:p>
+    <w:p/>
     <w:p>
       <w:pPr>
         <w:pStyle w:val="2"/>
       </w:pPr>
       <w:r>
+        <w:rPr>
+          <w:rFonts w:hint="eastAsia"/>
+        </w:rPr>
+        <w:t>見出し</w:t>
+      </w:r>
+      <w:r>
+        <w:rPr>
+          <w:rFonts w:hint="eastAsia"/>
+        </w:rPr>
+        <w:t>2</w:t>
+      </w:r>
+    </w:p>
+    <w:p/>
+    <w:p>
+      <w:pPr>
+        <w:pStyle w:val="a4"/>
+        <w:numPr>
+          <w:ilvl w:val="0"/>
+          <w:numId w:val="3"/>
+        </w:numPr>
+      </w:pPr>
+      <w:r>
+        <w:rPr>
+          <w:rFonts w:hint="eastAsia"/>
+        </w:rPr>
+        <w:t>いちご</w:t>
+      </w:r>
+    </w:p>
+    <w:p>
+      <w:pPr>
+        <w:pStyle w:val="a4"/>
+        <w:numPr>
+          <w:ilvl w:val="1"/>
+          <w:numId w:val="3"/>
+        </w:numPr>
+      </w:pPr>
+      <w:r>
+        <w:rPr>
+          <w:rFonts w:hint="eastAsia"/>
+        </w:rPr>
+        <w:t>りんご</w:t>
+      </w:r>
+    </w:p>
+    <w:p>
+      <w:pPr>
+        <w:pStyle w:val="a4"/>
+        <w:numPr>
+          <w:ilvl w:val="2"/>
+          <w:numId w:val="3"/>
+        </w:numPr>
+      </w:pPr>
+      <w:r>
+        <w:rPr>
+          <w:rFonts w:hint="eastAsia"/>
+        </w:rPr>
+        <w:t>ばなな</w:t>
+      </w:r>
+    </w:p>
+    <w:p>
+      <w:pPr>
+        <w:pStyle w:val="a4"/>
+        <w:numPr>
+          <w:ilvl w:val="0"/>
+          <w:numId w:val="3"/>
+        </w:numPr>
+      </w:pPr>
+      <w:r>
+        <w:rPr>
+          <w:rFonts w:hint="eastAsia"/>
+        </w:rPr>
+        <w:t>りんご</w:t>
+      </w:r>
+    </w:p>
+    <w:p>
+      <w:pPr>
+        <w:pStyle w:val="a4"/>
+        <w:numPr>
+          <w:ilvl w:val="1"/>
+          <w:numId w:val="3"/>
+        </w:numPr>
+        <w:rPr>
+          <w:rFonts w:hint="eastAsia"/>
+        </w:rPr>
+      </w:pPr>
+      <w:r>
+        <w:rPr>
+          <w:rFonts w:hint="eastAsia"/>
+        </w:rPr>
+        <w:t>ばなな</w:t>
+      </w:r>
+    </w:p>
+    <w:p/>
+    <w:p>
+      <w:pPr>
+        <w:pStyle w:val="3"/>
+        <w:rPr>
+          <w:rFonts w:hint="eastAsia"/>
+        </w:rPr>
+      </w:pPr>
+      <w:r>
+        <w:rPr>
+          <w:rFonts w:hint="eastAsia"/>
+        </w:rPr>
+        <w:t>見出し</w:t>
+      </w:r>
+      <w:r>
+        <w:rPr>
+          <w:rFonts w:hint="eastAsia"/>
+        </w:rPr>
+        <w:t>3</w:t>
+      </w:r>
+    </w:p>
+    <w:p/>
+    <w:p/>
+    <w:p>
+      <w:pPr>
+        <w:rPr>
+          <w:rFonts w:hint="eastAsia"/>
+        </w:rPr>
+      </w:pPr>
+      <w:r>
+        <w:rPr>
+          <w:rFonts w:hint="eastAsia"/>
+        </w:rPr>
+        <w:t>表</w:t>
+      </w:r>
+      <w:r>
+        <w:rPr>
+          <w:rFonts w:hint="eastAsia"/>
+        </w:rPr>
+        <w:t xml:space="preserve">1 </w:t>
+      </w:r>
+      <w:r>
+        <w:rPr>
+          <w:rFonts w:hint="eastAsia"/>
+        </w:rPr>
         <w:t>売上一覧</w:t>
+      </w:r>
+      <w:r>
+        <w:rPr>
+          <w:rFonts w:hint="eastAsia"/>
+        </w:rPr>
+        <w:t>1</w:t>
       </w:r>
     </w:p>
     <w:tbl>
@@ -53,12 +287,6 @@
         <w:gridCol w:w="2015"/>
       </w:tblGrid>
       <w:tr>
-        <w:tblPrEx>
-          <w:tblCellMar>
-            <w:top w:w="0" w:type="dxa"/>
-            <w:bottom w:w="0" w:type="dxa"/>
-          </w:tblCellMar>
-        </w:tblPrEx>
         <w:tc>
           <w:tcPr>
             <w:tcW w:w="0" w:type="auto"/>
@@ -117,12 +345,6 @@
         </w:tc>
       </w:tr>
       <w:tr>
-        <w:tblPrEx>
-          <w:tblCellMar>
-            <w:top w:w="0" w:type="dxa"/>
-            <w:bottom w:w="0" w:type="dxa"/>
-          </w:tblCellMar>
-        </w:tblPrEx>
         <w:tc>
           <w:tcPr>
             <w:tcW w:w="0" w:type="auto"/>
@@ -165,12 +387,6 @@
         </w:tc>
       </w:tr>
       <w:tr>
-        <w:tblPrEx>
-          <w:tblCellMar>
-            <w:top w:w="0" w:type="dxa"/>
-            <w:bottom w:w="0" w:type="dxa"/>
-          </w:tblCellMar>
-        </w:tblPrEx>
         <w:tc>
           <w:tcPr>
             <w:tcW w:w="0" w:type="auto"/>
@@ -213,12 +429,6 @@
         </w:tc>
       </w:tr>
       <w:tr>
-        <w:tblPrEx>
-          <w:tblCellMar>
-            <w:top w:w="0" w:type="dxa"/>
-            <w:bottom w:w="0" w:type="dxa"/>
-          </w:tblCellMar>
-        </w:tblPrEx>
         <w:tc>
           <w:tcPr>
             <w:tcW w:w="0" w:type="auto"/>
@@ -261,6 +471,693 @@
         </w:tc>
       </w:tr>
     </w:tbl>
+    <w:p>
+      <w:pPr>
+        <w:pStyle w:val="2"/>
+      </w:pPr>
+    </w:p>
+    <w:p>
+      <w:pPr>
+        <w:rPr>
+          <w:rFonts w:hint="eastAsia"/>
+        </w:rPr>
+      </w:pPr>
+    </w:p>
+    <w:p>
+      <w:pPr>
+        <w:rPr>
+          <w:rFonts w:hint="eastAsia"/>
+        </w:rPr>
+      </w:pPr>
+    </w:p>
+    <w:p>
+      <w:pPr>
+        <w:pStyle w:val="2"/>
+      </w:pPr>
+      <w:r>
+        <w:t>売上一覧</w:t>
+      </w:r>
+    </w:p>
+    <w:p/>
+    <w:p>
+      <w:pPr>
+        <w:rPr>
+          <w:rFonts w:hint="eastAsia"/>
+        </w:rPr>
+      </w:pPr>
+      <w:r>
+        <w:rPr>
+          <w:rFonts w:hint="eastAsia"/>
+        </w:rPr>
+        <w:t>表</w:t>
+      </w:r>
+      <w:r>
+        <w:rPr>
+          <w:rFonts w:hint="eastAsia"/>
+        </w:rPr>
+        <w:t xml:space="preserve">1 </w:t>
+      </w:r>
+      <w:r>
+        <w:rPr>
+          <w:rFonts w:hint="eastAsia"/>
+        </w:rPr>
+        <w:t>売上一覧</w:t>
+      </w:r>
+      <w:r>
+        <w:rPr>
+          <w:rFonts w:hint="eastAsia"/>
+        </w:rPr>
+        <w:t>2</w:t>
+      </w:r>
+    </w:p>
+    <w:tbl>
+      <w:tblPr>
+        <w:tblW w:w="5000" w:type="pct"/>
+        <w:tblBorders>
+          <w:top w:val="single" w:sz="4" w:space="0" w:color="auto"/>
+          <w:left w:val="single" w:sz="4" w:space="0" w:color="auto"/>
+          <w:bottom w:val="single" w:sz="4" w:space="0" w:color="auto"/>
+          <w:right w:val="single" w:sz="4" w:space="0" w:color="auto"/>
+          <w:insideH w:val="single" w:sz="4" w:space="0" w:color="auto"/>
+          <w:insideV w:val="single" w:sz="4" w:space="0" w:color="auto"/>
+        </w:tblBorders>
+        <w:tblCellMar>
+          <w:left w:w="10" w:type="dxa"/>
+          <w:right w:w="10" w:type="dxa"/>
+        </w:tblCellMar>
+        <w:tblLook w:val="0000" w:firstRow="0" w:lastRow="0" w:firstColumn="0" w:lastColumn="0" w:noHBand="0" w:noVBand="0"/>
+      </w:tblPr>
+      <w:tblGrid>
+        <w:gridCol w:w="2971"/>
+        <w:gridCol w:w="2015"/>
+        <w:gridCol w:w="2015"/>
+        <w:gridCol w:w="2015"/>
+      </w:tblGrid>
+      <w:tr>
+        <w:tc>
+          <w:tcPr>
+            <w:tcW w:w="0" w:type="auto"/>
+          </w:tcPr>
+          <w:p>
+            <w:r>
+              <w:rPr>
+                <w:b/>
+                <w:bCs/>
+              </w:rPr>
+              <w:t>商品名</w:t>
+            </w:r>
+          </w:p>
+        </w:tc>
+        <w:tc>
+          <w:tcPr>
+            <w:tcW w:w="0" w:type="auto"/>
+          </w:tcPr>
+          <w:p>
+            <w:r>
+              <w:rPr>
+                <w:b/>
+                <w:bCs/>
+              </w:rPr>
+              <w:t>数量</w:t>
+            </w:r>
+          </w:p>
+        </w:tc>
+        <w:tc>
+          <w:tcPr>
+            <w:tcW w:w="0" w:type="auto"/>
+          </w:tcPr>
+          <w:p>
+            <w:r>
+              <w:rPr>
+                <w:b/>
+                <w:bCs/>
+              </w:rPr>
+              <w:t>単価</w:t>
+            </w:r>
+          </w:p>
+        </w:tc>
+        <w:tc>
+          <w:tcPr>
+            <w:tcW w:w="0" w:type="auto"/>
+          </w:tcPr>
+          <w:p>
+            <w:r>
+              <w:rPr>
+                <w:b/>
+                <w:bCs/>
+              </w:rPr>
+              <w:t>合計</w:t>
+            </w:r>
+          </w:p>
+        </w:tc>
+      </w:tr>
+      <w:tr>
+        <w:tc>
+          <w:tcPr>
+            <w:tcW w:w="0" w:type="auto"/>
+          </w:tcPr>
+          <w:p>
+            <w:r>
+              <w:t>りんご</w:t>
+            </w:r>
+          </w:p>
+        </w:tc>
+        <w:tc>
+          <w:tcPr>
+            <w:tcW w:w="0" w:type="auto"/>
+          </w:tcPr>
+          <w:p>
+            <w:r>
+              <w:t>3</w:t>
+            </w:r>
+          </w:p>
+        </w:tc>
+        <w:tc>
+          <w:tcPr>
+            <w:tcW w:w="0" w:type="auto"/>
+          </w:tcPr>
+          <w:p>
+            <w:r>
+              <w:t>150</w:t>
+            </w:r>
+          </w:p>
+        </w:tc>
+        <w:tc>
+          <w:tcPr>
+            <w:tcW w:w="0" w:type="auto"/>
+          </w:tcPr>
+          <w:p>
+            <w:r>
+              <w:t>450</w:t>
+            </w:r>
+          </w:p>
+        </w:tc>
+      </w:tr>
+      <w:tr>
+        <w:tc>
+          <w:tcPr>
+            <w:tcW w:w="0" w:type="auto"/>
+          </w:tcPr>
+          <w:p>
+            <w:r>
+              <w:t>バナナ</w:t>
+            </w:r>
+          </w:p>
+        </w:tc>
+        <w:tc>
+          <w:tcPr>
+            <w:tcW w:w="0" w:type="auto"/>
+          </w:tcPr>
+          <w:p>
+            <w:r>
+              <w:t>5</w:t>
+            </w:r>
+          </w:p>
+        </w:tc>
+        <w:tc>
+          <w:tcPr>
+            <w:tcW w:w="0" w:type="auto"/>
+          </w:tcPr>
+          <w:p>
+            <w:r>
+              <w:t>100</w:t>
+            </w:r>
+          </w:p>
+        </w:tc>
+        <w:tc>
+          <w:tcPr>
+            <w:tcW w:w="0" w:type="auto"/>
+          </w:tcPr>
+          <w:p>
+            <w:r>
+              <w:t>500</w:t>
+            </w:r>
+          </w:p>
+        </w:tc>
+      </w:tr>
+      <w:tr>
+        <w:tc>
+          <w:tcPr>
+            <w:tcW w:w="0" w:type="auto"/>
+          </w:tcPr>
+          <w:p>
+            <w:r>
+              <w:t>みかん</w:t>
+            </w:r>
+          </w:p>
+        </w:tc>
+        <w:tc>
+          <w:tcPr>
+            <w:tcW w:w="0" w:type="auto"/>
+          </w:tcPr>
+          <w:p>
+            <w:r>
+              <w:t>8</w:t>
+            </w:r>
+          </w:p>
+        </w:tc>
+        <w:tc>
+          <w:tcPr>
+            <w:tcW w:w="0" w:type="auto"/>
+          </w:tcPr>
+          <w:p>
+            <w:r>
+              <w:t>80</w:t>
+            </w:r>
+          </w:p>
+        </w:tc>
+        <w:tc>
+          <w:tcPr>
+            <w:tcW w:w="0" w:type="auto"/>
+          </w:tcPr>
+          <w:p>
+            <w:r>
+              <w:t>640</w:t>
+            </w:r>
+          </w:p>
+        </w:tc>
+      </w:tr>
+    </w:tbl>
+    <w:p>
+      <w:pPr>
+        <w:pStyle w:val="2"/>
+      </w:pPr>
+    </w:p>
+    <w:p/>
+    <w:p>
+      <w:pPr>
+        <w:rPr>
+          <w:rFonts w:hint="eastAsia"/>
+        </w:rPr>
+      </w:pPr>
+    </w:p>
+    <w:p>
+      <w:pPr>
+        <w:pStyle w:val="ac"/>
+        <w:keepNext/>
+        <w:rPr>
+          <w:rFonts w:hint="eastAsia"/>
+        </w:rPr>
+      </w:pPr>
+      <w:r>
+        <w:rPr>
+          <w:rFonts w:hint="eastAsia"/>
+        </w:rPr>
+        <w:t>表</w:t>
+      </w:r>
+      <w:r>
+        <w:rPr>
+          <w:rFonts w:hint="eastAsia"/>
+        </w:rPr>
+        <w:t xml:space="preserve"> </w:t>
+      </w:r>
+      <w:r>
+        <w:fldChar w:fldCharType="begin"/>
+      </w:r>
+      <w:r>
+        <w:instrText xml:space="preserve"> </w:instrText>
+      </w:r>
+      <w:r>
+        <w:rPr>
+          <w:rFonts w:hint="eastAsia"/>
+        </w:rPr>
+        <w:instrText xml:space="preserve">SEQ </w:instrText>
+      </w:r>
+      <w:r>
+        <w:rPr>
+          <w:rFonts w:hint="eastAsia"/>
+        </w:rPr>
+        <w:instrText>表</w:instrText>
+      </w:r>
+      <w:r>
+        <w:rPr>
+          <w:rFonts w:hint="eastAsia"/>
+        </w:rPr>
+        <w:instrText xml:space="preserve"> \* ARABIC</w:instrText>
+      </w:r>
+      <w:r>
+        <w:instrText xml:space="preserve"> </w:instrText>
+      </w:r>
+      <w:r>
+        <w:fldChar w:fldCharType="separate"/>
+      </w:r>
+      <w:r>
+        <w:rPr>
+          <w:noProof/>
+        </w:rPr>
+        <w:t>1</w:t>
+      </w:r>
+      <w:r>
+        <w:fldChar w:fldCharType="end"/>
+      </w:r>
+      <w:r>
+        <w:rPr>
+          <w:rFonts w:hint="eastAsia"/>
+        </w:rPr>
+        <w:t xml:space="preserve">　売上一覧</w:t>
+      </w:r>
+      <w:r>
+        <w:rPr>
+          <w:rFonts w:hint="eastAsia"/>
+        </w:rPr>
+        <w:t>3</w:t>
+      </w:r>
+    </w:p>
+    <w:tbl>
+      <w:tblPr>
+        <w:tblW w:w="5000" w:type="pct"/>
+        <w:tblBorders>
+          <w:top w:val="single" w:sz="4" w:space="0" w:color="auto"/>
+          <w:left w:val="single" w:sz="4" w:space="0" w:color="auto"/>
+          <w:bottom w:val="single" w:sz="4" w:space="0" w:color="auto"/>
+          <w:right w:val="single" w:sz="4" w:space="0" w:color="auto"/>
+          <w:insideH w:val="single" w:sz="4" w:space="0" w:color="auto"/>
+          <w:insideV w:val="single" w:sz="4" w:space="0" w:color="auto"/>
+        </w:tblBorders>
+        <w:tblCellMar>
+          <w:left w:w="10" w:type="dxa"/>
+          <w:right w:w="10" w:type="dxa"/>
+        </w:tblCellMar>
+        <w:tblLook w:val="0000" w:firstRow="0" w:lastRow="0" w:firstColumn="0" w:lastColumn="0" w:noHBand="0" w:noVBand="0"/>
+      </w:tblPr>
+      <w:tblGrid>
+        <w:gridCol w:w="2971"/>
+        <w:gridCol w:w="2015"/>
+        <w:gridCol w:w="2015"/>
+        <w:gridCol w:w="2015"/>
+      </w:tblGrid>
+      <w:tr>
+        <w:tc>
+          <w:tcPr>
+            <w:tcW w:w="0" w:type="auto"/>
+          </w:tcPr>
+          <w:p>
+            <w:r>
+              <w:rPr>
+                <w:b/>
+                <w:bCs/>
+              </w:rPr>
+              <w:t>商品名</w:t>
+            </w:r>
+          </w:p>
+        </w:tc>
+        <w:tc>
+          <w:tcPr>
+            <w:tcW w:w="0" w:type="auto"/>
+          </w:tcPr>
+          <w:p>
+            <w:r>
+              <w:rPr>
+                <w:b/>
+                <w:bCs/>
+              </w:rPr>
+              <w:t>数量</w:t>
+            </w:r>
+          </w:p>
+        </w:tc>
+        <w:tc>
+          <w:tcPr>
+            <w:tcW w:w="0" w:type="auto"/>
+          </w:tcPr>
+          <w:p>
+            <w:r>
+              <w:rPr>
+                <w:b/>
+                <w:bCs/>
+              </w:rPr>
+              <w:t>単価</w:t>
+            </w:r>
+          </w:p>
+        </w:tc>
+        <w:tc>
+          <w:tcPr>
+            <w:tcW w:w="0" w:type="auto"/>
+          </w:tcPr>
+          <w:p>
+            <w:r>
+              <w:rPr>
+                <w:b/>
+                <w:bCs/>
+              </w:rPr>
+              <w:t>合計</w:t>
+            </w:r>
+          </w:p>
+        </w:tc>
+      </w:tr>
+      <w:tr>
+        <w:tc>
+          <w:tcPr>
+            <w:tcW w:w="0" w:type="auto"/>
+          </w:tcPr>
+          <w:p>
+            <w:r>
+              <w:t>りんご</w:t>
+            </w:r>
+          </w:p>
+        </w:tc>
+        <w:tc>
+          <w:tcPr>
+            <w:tcW w:w="0" w:type="auto"/>
+          </w:tcPr>
+          <w:p>
+            <w:r>
+              <w:t>3</w:t>
+            </w:r>
+          </w:p>
+        </w:tc>
+        <w:tc>
+          <w:tcPr>
+            <w:tcW w:w="0" w:type="auto"/>
+          </w:tcPr>
+          <w:p>
+            <w:r>
+              <w:t>150</w:t>
+            </w:r>
+          </w:p>
+        </w:tc>
+        <w:tc>
+          <w:tcPr>
+            <w:tcW w:w="0" w:type="auto"/>
+          </w:tcPr>
+          <w:p>
+            <w:r>
+              <w:t>450</w:t>
+            </w:r>
+          </w:p>
+        </w:tc>
+      </w:tr>
+      <w:tr>
+        <w:tc>
+          <w:tcPr>
+            <w:tcW w:w="0" w:type="auto"/>
+          </w:tcPr>
+          <w:p>
+            <w:r>
+              <w:lastRenderedPageBreak/>
+              <w:t>バナナ</w:t>
+            </w:r>
+          </w:p>
+        </w:tc>
+        <w:tc>
+          <w:tcPr>
+            <w:tcW w:w="0" w:type="auto"/>
+          </w:tcPr>
+          <w:p>
+            <w:r>
+              <w:t>5</w:t>
+            </w:r>
+          </w:p>
+        </w:tc>
+        <w:tc>
+          <w:tcPr>
+            <w:tcW w:w="0" w:type="auto"/>
+          </w:tcPr>
+          <w:p>
+            <w:r>
+              <w:t>100</w:t>
+            </w:r>
+          </w:p>
+        </w:tc>
+        <w:tc>
+          <w:tcPr>
+            <w:tcW w:w="0" w:type="auto"/>
+          </w:tcPr>
+          <w:p>
+            <w:r>
+              <w:t>500</w:t>
+            </w:r>
+          </w:p>
+        </w:tc>
+      </w:tr>
+      <w:tr>
+        <w:tc>
+          <w:tcPr>
+            <w:tcW w:w="0" w:type="auto"/>
+          </w:tcPr>
+          <w:p>
+            <w:r>
+              <w:t>みかん</w:t>
+            </w:r>
+          </w:p>
+        </w:tc>
+        <w:tc>
+          <w:tcPr>
+            <w:tcW w:w="0" w:type="auto"/>
+          </w:tcPr>
+          <w:p>
+            <w:r>
+              <w:t>8</w:t>
+            </w:r>
+          </w:p>
+        </w:tc>
+        <w:tc>
+          <w:tcPr>
+            <w:tcW w:w="0" w:type="auto"/>
+          </w:tcPr>
+          <w:p>
+            <w:r>
+              <w:t>80</w:t>
+            </w:r>
+          </w:p>
+        </w:tc>
+        <w:tc>
+          <w:tcPr>
+            <w:tcW w:w="0" w:type="auto"/>
+          </w:tcPr>
+          <w:p>
+            <w:r>
+              <w:t>640</w:t>
+            </w:r>
+          </w:p>
+        </w:tc>
+      </w:tr>
+    </w:tbl>
+    <w:p>
+      <w:pPr>
+        <w:pStyle w:val="2"/>
+      </w:pPr>
+    </w:p>
+    <w:p>
+      <w:pPr>
+        <w:pStyle w:val="2"/>
+      </w:pPr>
+    </w:p>
+    <w:p>
+      <w:pPr>
+        <w:pStyle w:val="2"/>
+      </w:pPr>
+    </w:p>
+    <w:p>
+      <w:pPr>
+        <w:keepNext/>
+      </w:pPr>
+      <w:r>
+        <w:drawing>
+          <wp:inline distT="0" distB="0" distL="0" distR="0" wp14:anchorId="2BA56FE6" wp14:editId="04C292F0">
+            <wp:extent cx="4458322" cy="4115374"/>
+            <wp:effectExtent l="0" t="0" r="0" b="0"/>
+            <wp:docPr id="1406254602" name="図 1"/>
+            <wp:cNvGraphicFramePr>
+              <a:graphicFrameLocks xmlns:a="http://schemas.openxmlformats.org/drawingml/2006/main" noChangeAspect="1"/>
+            </wp:cNvGraphicFramePr>
+            <a:graphic xmlns:a="http://schemas.openxmlformats.org/drawingml/2006/main">
+              <a:graphicData uri="http://schemas.openxmlformats.org/drawingml/2006/picture">
+                <pic:pic xmlns:pic="http://schemas.openxmlformats.org/drawingml/2006/picture">
+                  <pic:nvPicPr>
+                    <pic:cNvPr id="1406254602" name=""/>
+                    <pic:cNvPicPr/>
+                  </pic:nvPicPr>
+                  <pic:blipFill>
+                    <a:blip r:embed="rId6"/>
+                    <a:stretch>
+                      <a:fillRect/>
+                    </a:stretch>
+                  </pic:blipFill>
+                  <pic:spPr>
+                    <a:xfrm>
+                      <a:off x="0" y="0"/>
+                      <a:ext cx="4458322" cy="4115374"/>
+                    </a:xfrm>
+                    <a:prstGeom prst="rect">
+                      <a:avLst/>
+                    </a:prstGeom>
+                  </pic:spPr>
+                </pic:pic>
+              </a:graphicData>
+            </a:graphic>
+          </wp:inline>
+        </w:drawing>
+      </w:r>
+    </w:p>
+    <w:p>
+      <w:pPr>
+        <w:pStyle w:val="ac"/>
+      </w:pPr>
+      <w:r>
+        <w:rPr>
+          <w:rFonts w:hint="eastAsia"/>
+        </w:rPr>
+        <w:t>図</w:t>
+      </w:r>
+      <w:r>
+        <w:rPr>
+          <w:rFonts w:hint="eastAsia"/>
+        </w:rPr>
+        <w:t xml:space="preserve"> </w:t>
+      </w:r>
+      <w:r>
+        <w:fldChar w:fldCharType="begin"/>
+      </w:r>
+      <w:r>
+        <w:instrText xml:space="preserve"> </w:instrText>
+      </w:r>
+      <w:r>
+        <w:rPr>
+          <w:rFonts w:hint="eastAsia"/>
+        </w:rPr>
+        <w:instrText xml:space="preserve">SEQ </w:instrText>
+      </w:r>
+      <w:r>
+        <w:rPr>
+          <w:rFonts w:hint="eastAsia"/>
+        </w:rPr>
+        <w:instrText>図</w:instrText>
+      </w:r>
+      <w:r>
+        <w:rPr>
+          <w:rFonts w:hint="eastAsia"/>
+        </w:rPr>
+        <w:instrText xml:space="preserve"> \* ARABIC</w:instrText>
+      </w:r>
+      <w:r>
+        <w:instrText xml:space="preserve"> </w:instrText>
+      </w:r>
+      <w:r>
+        <w:fldChar w:fldCharType="separate"/>
+      </w:r>
+      <w:r>
+        <w:rPr>
+          <w:noProof/>
+        </w:rPr>
+        <w:t>1</w:t>
+      </w:r>
+      <w:r>
+        <w:fldChar w:fldCharType="end"/>
+      </w:r>
+      <w:r>
+        <w:rPr>
+          <w:rFonts w:hint="eastAsia"/>
+        </w:rPr>
+        <w:t>ドーナツ</w:t>
+      </w:r>
+    </w:p>
+    <w:p>
+      <w:pPr>
+        <w:rPr>
+          <w:rFonts w:hint="eastAsia"/>
+        </w:rPr>
+      </w:pPr>
+    </w:p>
     <w:p>
       <w:pPr>
         <w:pStyle w:val="2"/>
@@ -292,7 +1189,7 @@
                     </pic:cNvPicPr>
                   </pic:nvPicPr>
                   <pic:blipFill>
-                    <a:blip r:embed="rId5"/>
+                    <a:blip r:embed="rId7"/>
                     <a:srcRect/>
                     <a:stretch>
                       <a:fillRect/>
@@ -316,6 +1213,33 @@
     </w:p>
     <w:p>
       <w:r>
+        <w:rPr>
+          <w:rFonts w:hint="eastAsia"/>
+        </w:rPr>
+        <w:t>図</w:t>
+      </w:r>
+      <w:r>
+        <w:rPr>
+          <w:rFonts w:hint="eastAsia"/>
+        </w:rPr>
+        <w:t>1-2</w:t>
+      </w:r>
+      <w:r>
+        <w:rPr>
+          <w:rFonts w:hint="eastAsia"/>
+        </w:rPr>
+        <w:t xml:space="preserve">　売上グラフ</w:t>
+      </w:r>
+    </w:p>
+    <w:p>
+      <w:pPr>
+        <w:rPr>
+          <w:rFonts w:hint="eastAsia"/>
+        </w:rPr>
+      </w:pPr>
+    </w:p>
+    <w:p>
+      <w:r>
         <w:t>上のグラフは各商品の売上を示しています。詳細は表を参照してください。</w:t>
       </w:r>
     </w:p>
@@ -347,7 +1271,7 @@
                     <pic:cNvPicPr/>
                   </pic:nvPicPr>
                   <pic:blipFill>
-                    <a:blip r:embed="rId6" cstate="print">
+                    <a:blip r:embed="rId8" cstate="print">
                       <a:extLst>
                         <a:ext uri="{28A0092B-C50C-407E-A947-70E740481C1C}">
                           <a14:useLocalDpi xmlns:a14="http://schemas.microsoft.com/office/drawing/2010/main" val="0"/>
@@ -424,7 +1348,7 @@
         <w:rPr>
           <w:noProof/>
         </w:rPr>
-        <w:t>1</w:t>
+        <w:t>2</w:t>
       </w:r>
       <w:r>
         <w:fldChar w:fldCharType="end"/>
@@ -432,6 +1356,130 @@
       <w:r>
         <w:t>猫</w:t>
       </w:r>
+    </w:p>
+    <w:p/>
+    <w:p>
+      <w:pPr>
+        <w:pStyle w:val="1"/>
+      </w:pPr>
+      <w:r>
+        <w:rPr>
+          <w:rFonts w:hint="eastAsia"/>
+        </w:rPr>
+        <w:t>調査結果</w:t>
+      </w:r>
+    </w:p>
+    <w:p/>
+    <w:p>
+      <w:pPr>
+        <w:pStyle w:val="ac"/>
+        <w:keepNext/>
+      </w:pPr>
+      <w:r>
+        <w:rPr>
+          <w:rFonts w:hint="eastAsia"/>
+        </w:rPr>
+        <w:t>表</w:t>
+      </w:r>
+      <w:r>
+        <w:rPr>
+          <w:rFonts w:hint="eastAsia"/>
+        </w:rPr>
+        <w:t xml:space="preserve"> </w:t>
+      </w:r>
+      <w:r>
+        <w:fldChar w:fldCharType="begin"/>
+      </w:r>
+      <w:r>
+        <w:instrText xml:space="preserve"> </w:instrText>
+      </w:r>
+      <w:r>
+        <w:rPr>
+          <w:rFonts w:hint="eastAsia"/>
+        </w:rPr>
+        <w:instrText xml:space="preserve">SEQ </w:instrText>
+      </w:r>
+      <w:r>
+        <w:rPr>
+          <w:rFonts w:hint="eastAsia"/>
+        </w:rPr>
+        <w:instrText>表</w:instrText>
+      </w:r>
+      <w:r>
+        <w:rPr>
+          <w:rFonts w:hint="eastAsia"/>
+        </w:rPr>
+        <w:instrText xml:space="preserve"> \* ARABIC</w:instrText>
+      </w:r>
+      <w:r>
+        <w:instrText xml:space="preserve"> </w:instrText>
+      </w:r>
+      <w:r>
+        <w:fldChar w:fldCharType="separate"/>
+      </w:r>
+      <w:r>
+        <w:rPr>
+          <w:noProof/>
+        </w:rPr>
+        <w:t>2</w:t>
+      </w:r>
+      <w:r>
+        <w:fldChar w:fldCharType="end"/>
+      </w:r>
+      <w:r>
+        <w:rPr>
+          <w:rFonts w:hint="eastAsia"/>
+        </w:rPr>
+        <w:t xml:space="preserve">　生命保険</w:t>
+      </w:r>
+    </w:p>
+    <w:p>
+      <w:r>
+        <w:drawing>
+          <wp:inline distT="0" distB="0" distL="0" distR="0" wp14:anchorId="6C49ADA4" wp14:editId="2F0BA123">
+            <wp:extent cx="5731510" cy="2112010"/>
+            <wp:effectExtent l="0" t="0" r="2540" b="2540"/>
+            <wp:docPr id="1994475288" name="図 1"/>
+            <wp:cNvGraphicFramePr>
+              <a:graphicFrameLocks xmlns:a="http://schemas.openxmlformats.org/drawingml/2006/main" noChangeAspect="1"/>
+            </wp:cNvGraphicFramePr>
+            <a:graphic xmlns:a="http://schemas.openxmlformats.org/drawingml/2006/main">
+              <a:graphicData uri="http://schemas.openxmlformats.org/drawingml/2006/picture">
+                <pic:pic xmlns:pic="http://schemas.openxmlformats.org/drawingml/2006/picture">
+                  <pic:nvPicPr>
+                    <pic:cNvPr id="1994475288" name=""/>
+                    <pic:cNvPicPr/>
+                  </pic:nvPicPr>
+                  <pic:blipFill>
+                    <a:blip r:embed="rId9"/>
+                    <a:stretch>
+                      <a:fillRect/>
+                    </a:stretch>
+                  </pic:blipFill>
+                  <pic:spPr>
+                    <a:xfrm>
+                      <a:off x="0" y="0"/>
+                      <a:ext cx="5731510" cy="2112010"/>
+                    </a:xfrm>
+                    <a:prstGeom prst="rect">
+                      <a:avLst/>
+                    </a:prstGeom>
+                  </pic:spPr>
+                </pic:pic>
+              </a:graphicData>
+            </a:graphic>
+          </wp:inline>
+        </w:drawing>
+      </w:r>
+    </w:p>
+    <w:p/>
+    <w:p/>
+    <w:p>
+      <w:pPr>
+        <w:rPr>
+          <w:rFonts w:hint="eastAsia"/>
+        </w:rPr>
+      </w:pPr>
     </w:p>
     <w:sectPr>
       <w:pgSz w:w="11906" w:h="16838"/>
@@ -531,11 +1579,216 @@
       </w:pPr>
     </w:lvl>
   </w:abstractNum>
+  <w:abstractNum w:abstractNumId="1" w15:restartNumberingAfterBreak="0">
+    <w:nsid w:val="3FF96428"/>
+    <w:multiLevelType w:val="hybridMultilevel"/>
+    <w:tmpl w:val="60F87AA2"/>
+    <w:lvl w:ilvl="0" w:tplc="04090001">
+      <w:start w:val="1"/>
+      <w:numFmt w:val="bullet"/>
+      <w:lvlText w:val=""/>
+      <w:lvlJc w:val="left"/>
+      <w:pPr>
+        <w:ind w:left="440" w:hanging="440"/>
+      </w:pPr>
+      <w:rPr>
+        <w:rFonts w:ascii="Wingdings" w:hAnsi="Wingdings" w:hint="default"/>
+      </w:rPr>
+    </w:lvl>
+    <w:lvl w:ilvl="1" w:tplc="0409000B">
+      <w:start w:val="1"/>
+      <w:numFmt w:val="bullet"/>
+      <w:lvlText w:val=""/>
+      <w:lvlJc w:val="left"/>
+      <w:pPr>
+        <w:ind w:left="880" w:hanging="440"/>
+      </w:pPr>
+      <w:rPr>
+        <w:rFonts w:ascii="Wingdings" w:hAnsi="Wingdings" w:hint="default"/>
+      </w:rPr>
+    </w:lvl>
+    <w:lvl w:ilvl="2" w:tplc="0409000D">
+      <w:start w:val="1"/>
+      <w:numFmt w:val="bullet"/>
+      <w:lvlText w:val=""/>
+      <w:lvlJc w:val="left"/>
+      <w:pPr>
+        <w:ind w:left="1320" w:hanging="440"/>
+      </w:pPr>
+      <w:rPr>
+        <w:rFonts w:ascii="Wingdings" w:hAnsi="Wingdings" w:hint="default"/>
+      </w:rPr>
+    </w:lvl>
+    <w:lvl w:ilvl="3" w:tplc="04090001" w:tentative="1">
+      <w:start w:val="1"/>
+      <w:numFmt w:val="bullet"/>
+      <w:lvlText w:val=""/>
+      <w:lvlJc w:val="left"/>
+      <w:pPr>
+        <w:ind w:left="1760" w:hanging="440"/>
+      </w:pPr>
+      <w:rPr>
+        <w:rFonts w:ascii="Wingdings" w:hAnsi="Wingdings" w:hint="default"/>
+      </w:rPr>
+    </w:lvl>
+    <w:lvl w:ilvl="4" w:tplc="0409000B" w:tentative="1">
+      <w:start w:val="1"/>
+      <w:numFmt w:val="bullet"/>
+      <w:lvlText w:val=""/>
+      <w:lvlJc w:val="left"/>
+      <w:pPr>
+        <w:ind w:left="2200" w:hanging="440"/>
+      </w:pPr>
+      <w:rPr>
+        <w:rFonts w:ascii="Wingdings" w:hAnsi="Wingdings" w:hint="default"/>
+      </w:rPr>
+    </w:lvl>
+    <w:lvl w:ilvl="5" w:tplc="0409000D" w:tentative="1">
+      <w:start w:val="1"/>
+      <w:numFmt w:val="bullet"/>
+      <w:lvlText w:val=""/>
+      <w:lvlJc w:val="left"/>
+      <w:pPr>
+        <w:ind w:left="2640" w:hanging="440"/>
+      </w:pPr>
+      <w:rPr>
+        <w:rFonts w:ascii="Wingdings" w:hAnsi="Wingdings" w:hint="default"/>
+      </w:rPr>
+    </w:lvl>
+    <w:lvl w:ilvl="6" w:tplc="04090001" w:tentative="1">
+      <w:start w:val="1"/>
+      <w:numFmt w:val="bullet"/>
+      <w:lvlText w:val=""/>
+      <w:lvlJc w:val="left"/>
+      <w:pPr>
+        <w:ind w:left="3080" w:hanging="440"/>
+      </w:pPr>
+      <w:rPr>
+        <w:rFonts w:ascii="Wingdings" w:hAnsi="Wingdings" w:hint="default"/>
+      </w:rPr>
+    </w:lvl>
+    <w:lvl w:ilvl="7" w:tplc="0409000B" w:tentative="1">
+      <w:start w:val="1"/>
+      <w:numFmt w:val="bullet"/>
+      <w:lvlText w:val=""/>
+      <w:lvlJc w:val="left"/>
+      <w:pPr>
+        <w:ind w:left="3520" w:hanging="440"/>
+      </w:pPr>
+      <w:rPr>
+        <w:rFonts w:ascii="Wingdings" w:hAnsi="Wingdings" w:hint="default"/>
+      </w:rPr>
+    </w:lvl>
+    <w:lvl w:ilvl="8" w:tplc="0409000D" w:tentative="1">
+      <w:start w:val="1"/>
+      <w:numFmt w:val="bullet"/>
+      <w:lvlText w:val=""/>
+      <w:lvlJc w:val="left"/>
+      <w:pPr>
+        <w:ind w:left="3960" w:hanging="440"/>
+      </w:pPr>
+      <w:rPr>
+        <w:rFonts w:ascii="Wingdings" w:hAnsi="Wingdings" w:hint="default"/>
+      </w:rPr>
+    </w:lvl>
+  </w:abstractNum>
+  <w:abstractNum w:abstractNumId="2" w15:restartNumberingAfterBreak="0">
+    <w:nsid w:val="516837E0"/>
+    <w:multiLevelType w:val="hybridMultilevel"/>
+    <w:tmpl w:val="A7DE6AC2"/>
+    <w:lvl w:ilvl="0" w:tplc="0409000F">
+      <w:start w:val="1"/>
+      <w:numFmt w:val="decimal"/>
+      <w:lvlText w:val="%1."/>
+      <w:lvlJc w:val="left"/>
+      <w:pPr>
+        <w:ind w:left="440" w:hanging="440"/>
+      </w:pPr>
+    </w:lvl>
+    <w:lvl w:ilvl="1" w:tplc="04090017">
+      <w:start w:val="1"/>
+      <w:numFmt w:val="aiueoFullWidth"/>
+      <w:lvlText w:val="(%2)"/>
+      <w:lvlJc w:val="left"/>
+      <w:pPr>
+        <w:ind w:left="880" w:hanging="440"/>
+      </w:pPr>
+    </w:lvl>
+    <w:lvl w:ilvl="2" w:tplc="04090011">
+      <w:start w:val="1"/>
+      <w:numFmt w:val="decimalEnclosedCircle"/>
+      <w:lvlText w:val="%3"/>
+      <w:lvlJc w:val="left"/>
+      <w:pPr>
+        <w:ind w:left="1320" w:hanging="440"/>
+      </w:pPr>
+    </w:lvl>
+    <w:lvl w:ilvl="3" w:tplc="0409000F" w:tentative="1">
+      <w:start w:val="1"/>
+      <w:numFmt w:val="decimal"/>
+      <w:lvlText w:val="%4."/>
+      <w:lvlJc w:val="left"/>
+      <w:pPr>
+        <w:ind w:left="1760" w:hanging="440"/>
+      </w:pPr>
+    </w:lvl>
+    <w:lvl w:ilvl="4" w:tplc="04090017" w:tentative="1">
+      <w:start w:val="1"/>
+      <w:numFmt w:val="aiueoFullWidth"/>
+      <w:lvlText w:val="(%5)"/>
+      <w:lvlJc w:val="left"/>
+      <w:pPr>
+        <w:ind w:left="2200" w:hanging="440"/>
+      </w:pPr>
+    </w:lvl>
+    <w:lvl w:ilvl="5" w:tplc="04090011" w:tentative="1">
+      <w:start w:val="1"/>
+      <w:numFmt w:val="decimalEnclosedCircle"/>
+      <w:lvlText w:val="%6"/>
+      <w:lvlJc w:val="left"/>
+      <w:pPr>
+        <w:ind w:left="2640" w:hanging="440"/>
+      </w:pPr>
+    </w:lvl>
+    <w:lvl w:ilvl="6" w:tplc="0409000F" w:tentative="1">
+      <w:start w:val="1"/>
+      <w:numFmt w:val="decimal"/>
+      <w:lvlText w:val="%7."/>
+      <w:lvlJc w:val="left"/>
+      <w:pPr>
+        <w:ind w:left="3080" w:hanging="440"/>
+      </w:pPr>
+    </w:lvl>
+    <w:lvl w:ilvl="7" w:tplc="04090017" w:tentative="1">
+      <w:start w:val="1"/>
+      <w:numFmt w:val="aiueoFullWidth"/>
+      <w:lvlText w:val="(%8)"/>
+      <w:lvlJc w:val="left"/>
+      <w:pPr>
+        <w:ind w:left="3520" w:hanging="440"/>
+      </w:pPr>
+    </w:lvl>
+    <w:lvl w:ilvl="8" w:tplc="04090011" w:tentative="1">
+      <w:start w:val="1"/>
+      <w:numFmt w:val="decimalEnclosedCircle"/>
+      <w:lvlText w:val="%9"/>
+      <w:lvlJc w:val="left"/>
+      <w:pPr>
+        <w:ind w:left="3960" w:hanging="440"/>
+      </w:pPr>
+    </w:lvl>
+  </w:abstractNum>
   <w:num w:numId="1" w16cid:durableId="1777557890">
     <w:abstractNumId w:val="0"/>
     <w:lvlOverride w:ilvl="0">
       <w:startOverride w:val="1"/>
     </w:lvlOverride>
+  </w:num>
+  <w:num w:numId="2" w16cid:durableId="661010156">
+    <w:abstractNumId w:val="1"/>
+  </w:num>
+  <w:num w:numId="3" w16cid:durableId="1861581206">
+    <w:abstractNumId w:val="2"/>
   </w:num>
 </w:numbering>
 </file>
@@ -952,6 +2205,7 @@
     <w:name w:val="heading 2"/>
     <w:basedOn w:val="a"/>
     <w:next w:val="a"/>
+    <w:link w:val="20"/>
     <w:uiPriority w:val="9"/>
     <w:unhideWhenUsed/>
     <w:qFormat/>
@@ -969,7 +2223,6 @@
     <w:basedOn w:val="a"/>
     <w:next w:val="a"/>
     <w:uiPriority w:val="9"/>
-    <w:semiHidden/>
     <w:unhideWhenUsed/>
     <w:qFormat/>
     <w:pPr>
@@ -1159,6 +2412,18 @@
       <w:bCs/>
       <w:sz w:val="21"/>
       <w:szCs w:val="21"/>
+    </w:rPr>
+  </w:style>
+  <w:style w:type="character" w:customStyle="1" w:styleId="20">
+    <w:name w:val="見出し 2 (文字)"/>
+    <w:basedOn w:val="a0"/>
+    <w:link w:val="2"/>
+    <w:uiPriority w:val="9"/>
+    <w:rsid w:val="00EB4544"/>
+    <w:rPr>
+      <w:color w:val="2E74B5"/>
+      <w:sz w:val="26"/>
+      <w:szCs w:val="26"/>
     </w:rPr>
   </w:style>
 </w:styles>
@@ -1457,4 +2722,16 @@
     </a:ext>
   </a:extLst>
 </a:theme>
+</file>
+
+<file path=customXml/item1.xml><?xml version="1.0" encoding="utf-8"?>
+<b:Sources xmlns:b="http://schemas.openxmlformats.org/officeDocument/2006/bibliography" xmlns="http://schemas.openxmlformats.org/officeDocument/2006/bibliography" SelectedStyle="\APASixthEditionOfficeOnline.xsl" StyleName="APA" Version="6"/>
+</file>
+
+<file path=customXml/itemProps1.xml><?xml version="1.0" encoding="utf-8"?>
+<ds:datastoreItem xmlns:ds="http://schemas.openxmlformats.org/officeDocument/2006/customXml" ds:itemID="{5C138EDA-7452-4622-BB91-BF6973EC2FC1}">
+  <ds:schemaRefs>
+    <ds:schemaRef ds:uri="http://schemas.openxmlformats.org/officeDocument/2006/bibliography"/>
+  </ds:schemaRefs>
+</ds:datastoreItem>
 </file>
</xml_diff>